<commit_message>
Restore original TRL layout while keeping dense content
</commit_message>
<xml_diff>
--- a/e-PU Cabinet V2/TRL Phases Explained.docx
+++ b/e-PU Cabinet V2/TRL Phases Explained.docx
@@ -52,7 +52,7 @@
     <w:p>
       <w:pPr/>
       <w:r>
-        <w:t>This document explains what each Technology Readiness Level (TRL) phase means in general: a plain-language definition of the level, the goal of the phase, what is typically done in it, the environment/fidelity it is tested at, what is normally used to prove you have reached it, common pitfalls, and how the phase maps onto the projects in this repository. It is written as a general reference so it can be applied to any of the hardware/engineering projects here (e.g. the 400 A Charger, the e-PU Cabinet V2 BESS, etc.).</w:t>
+        <w:t>This document explains what each Technology Readiness Level (TRL) phase means in general: what the goal of the phase is, what should typically be done in it, and what is normally used to prove you have reached it. It is written as a general reference so it can be applied to any of the hardware/engineering projects in this repository (e.g. the 400 A Charger, the e-PU Cabinet V2 BESS, etc.).</w:t>
       </w:r>
     </w:p>
     <w:p>
@@ -577,11 +577,6 @@
       <w:pPr/>
     </w:p>
     <w:p>
-      <w:r>
-        <w:br w:type="page"/>
-      </w:r>
-    </w:p>
-    <w:p>
       <w:pPr>
         <w:pStyle w:val="Kop1"/>
       </w:pPr>
@@ -590,9 +585,17 @@
       </w:r>
     </w:p>
     <w:p>
-      <w:pPr/>
-      <w:r>
-        <w:t xml:space="preserve">TRL 1 is the lowest level of technology maturity. Scientific research is just beginning to be translated into applied research and development: basic scientific principles are observed and reported, but no practical application has been identified yet. In the NASA and EU Horizon 2020 definitions this is the "paper study" level — you understand </w:t>
+      <w:pPr>
+        <w:pStyle w:val="Kop2"/>
+      </w:pPr>
+      <w:r>
+        <w:t>Goal</w:t>
+      </w:r>
+    </w:p>
+    <w:p>
+      <w:pPr/>
+      <w:r>
+        <w:t xml:space="preserve">TRL 1 is the lowest level of technology maturity: basic scientific principles are observed and reported, but no practical application has been identified yet — in the NASA and EU Horizon 2020 definitions this is the "paper study" level, where you understand </w:t>
       </w:r>
       <w:r>
         <w:rPr>
@@ -610,21 +613,7 @@
         <w:t>how</w:t>
       </w:r>
       <w:r>
-        <w:t xml:space="preserve"> to use it.</w:t>
-      </w:r>
-    </w:p>
-    <w:p>
-      <w:pPr>
-        <w:pStyle w:val="Kop2"/>
-      </w:pPr>
-      <w:r>
-        <w:t>Goal</w:t>
-      </w:r>
-    </w:p>
-    <w:p>
-      <w:pPr/>
-      <w:r>
-        <w:t>Establish and document that the underlying scientific/engineering principle the future product will rely on genuinely exists and is understood.</w:t>
+        <w:t xml:space="preserve"> to use it. Establish and document that the underlying scientific/engineering principle the future product will rely on genuinely exists and is understood.</w:t>
       </w:r>
     </w:p>
     <w:p>
@@ -685,133 +674,6 @@
     </w:p>
     <w:p>
       <w:pPr>
-        <w:pStyle w:val="Kop2"/>
-      </w:pPr>
-      <w:r>
-        <w:t>Environment &amp; fidelity</w:t>
-      </w:r>
-    </w:p>
-    <w:p>
-      <w:pPr/>
-      <w:r>
-        <w:t>Entirely on paper / in the scientific literature. There is no hardware, no device model, and no defined operating environment.</w:t>
-      </w:r>
-    </w:p>
-    <w:p>
-      <w:pPr>
-        <w:pStyle w:val="Kop2"/>
-      </w:pPr>
-      <w:r>
-        <w:t>Typical output / evidence (exit criteria)</w:t>
-      </w:r>
-    </w:p>
-    <w:p>
-      <w:pPr/>
-      <w:r>
-        <w:t xml:space="preserve">Research notes or a short survey report that identifies the relevant principle(s), with references to papers, textbooks or standards. Reviewers should be able to answer </w:t>
-      </w:r>
-      <w:r>
-        <w:rPr>
-          <w:i/>
-        </w:rPr>
-        <w:t>"is this physically possible?"</w:t>
-      </w:r>
-      <w:r>
-        <w:t xml:space="preserve"> with a documented "yes".</w:t>
-      </w:r>
-    </w:p>
-    <w:p>
-      <w:pPr>
-        <w:pStyle w:val="Kop2"/>
-      </w:pPr>
-      <w:r>
-        <w:t>Common pitfalls</w:t>
-      </w:r>
-    </w:p>
-    <w:p>
-      <w:pPr/>
-      <w:r>
-        <w:t>Jumping to a solution before the principle is understood; confusing a known principle with a proven application (that is TRL 3+, not TRL 1).</w:t>
-      </w:r>
-    </w:p>
-    <w:p>
-      <w:pPr>
-        <w:pStyle w:val="Kop2"/>
-      </w:pPr>
-      <w:r>
-        <w:t>How this applies to this repository</w:t>
-      </w:r>
-    </w:p>
-    <w:p>
-      <w:pPr/>
-      <w:r>
-        <w:t>For the power-electronics projects here (400 A AC/DC charger, e-PU Cabinet V2 BESS) the basic principles — galvanic isolation, PFC rectification, DC/DC conversion, liquid cooling, Li-ion storage — are long-established and well documented. TRL 1 is therefore effectively "prior art"; it is assumed complete before the project starts and is not called out as an explicit task.</w:t>
-      </w:r>
-    </w:p>
-    <w:p>
-      <w:pPr/>
-    </w:p>
-    <w:p>
-      <w:r>
-        <w:br w:type="page"/>
-      </w:r>
-    </w:p>
-    <w:p>
-      <w:pPr>
-        <w:pStyle w:val="Kop1"/>
-      </w:pPr>
-      <w:r>
-        <w:t>TRL 2 — Technology Concept Formulated</w:t>
-      </w:r>
-    </w:p>
-    <w:p>
-      <w:pPr/>
-      <w:r>
-        <w:t xml:space="preserve">Once basic principles are observed, practical applications can be invented. TRL 2 is where a </w:t>
-      </w:r>
-      <w:r>
-        <w:rPr>
-          <w:i/>
-        </w:rPr>
-        <w:t>specific</w:t>
-      </w:r>
-      <w:r>
-        <w:t xml:space="preserve"> technology concept and its intended application are formulated. The concept is still speculative — there is little or no experimental proof yet — but the intended use, the analytical reasoning and the expected benefit are written down.</w:t>
-      </w:r>
-    </w:p>
-    <w:p>
-      <w:pPr>
-        <w:pStyle w:val="Kop2"/>
-      </w:pPr>
-      <w:r>
-        <w:t>Goal</w:t>
-      </w:r>
-    </w:p>
-    <w:p>
-      <w:pPr/>
-      <w:r>
-        <w:t xml:space="preserve">Turn the known principle into a defined, </w:t>
-      </w:r>
-      <w:r>
-        <w:rPr>
-          <w:i/>
-        </w:rPr>
-        <w:t>possible</w:t>
-      </w:r>
-      <w:r>
-        <w:t xml:space="preserve"> product concept: state what would be built, for whom, and against which requirements — even though nothing has been proven.</w:t>
-      </w:r>
-    </w:p>
-    <w:p>
-      <w:pPr>
-        <w:pStyle w:val="Kop2"/>
-      </w:pPr>
-      <w:r>
-        <w:t>What is normally done</w:t>
-      </w:r>
-    </w:p>
-    <w:p>
-      <w:pPr>
         <w:pStyle w:val="Lijstalinea"/>
         <w:numPr>
           <w:ilvl w:val="0"/>
@@ -819,7 +681,90 @@
         </w:numPr>
       </w:pPr>
       <w:r>
-        <w:t>Define the concept and its intended use (the product idea and its application).</w:t>
+        <w:t>Done entirely on paper / in the scientific literature: there is no hardware, no device model and no defined operating environment.</w:t>
+      </w:r>
+    </w:p>
+    <w:p>
+      <w:pPr>
+        <w:pStyle w:val="Kop2"/>
+      </w:pPr>
+      <w:r>
+        <w:t>Typical output / evidence</w:t>
+      </w:r>
+    </w:p>
+    <w:p>
+      <w:pPr/>
+      <w:r>
+        <w:t xml:space="preserve">Research notes or a short survey report that identifies the relevant principle(s), with references to papers, textbooks or standards. Reviewers should be able to answer </w:t>
+      </w:r>
+      <w:r>
+        <w:rPr>
+          <w:i/>
+        </w:rPr>
+        <w:t>"is this physically possible?"</w:t>
+      </w:r>
+      <w:r>
+        <w:t xml:space="preserve"> with a documented "yes". Common pitfalls to avoid: jumping to a solution before the principle is understood, and confusing a known principle with a proven application (that is TRL 3+, not TRL 1).</w:t>
+      </w:r>
+    </w:p>
+    <w:p>
+      <w:pPr/>
+    </w:p>
+    <w:p>
+      <w:pPr/>
+      <w:r>
+        <w:t>Note: For the power-electronics projects here (400 A AC/DC charger, e-PU Cabinet V2 BESS) the basic principles — galvanic isolation, PFC rectification, DC/DC conversion, liquid cooling, Li-ion storage — are long-established and well documented. TRL 1 is therefore effectively "prior art"; it is assumed complete before the project starts and is not called out as an explicit task.</w:t>
+      </w:r>
+    </w:p>
+    <w:p>
+      <w:pPr/>
+    </w:p>
+    <w:p>
+      <w:pPr>
+        <w:pStyle w:val="Kop1"/>
+      </w:pPr>
+      <w:r>
+        <w:t>TRL 2 — Technology Concept Formulated</w:t>
+      </w:r>
+    </w:p>
+    <w:p>
+      <w:pPr>
+        <w:pStyle w:val="Kop2"/>
+      </w:pPr>
+      <w:r>
+        <w:t>Goal</w:t>
+      </w:r>
+    </w:p>
+    <w:p>
+      <w:pPr/>
+      <w:r>
+        <w:t xml:space="preserve">Once basic principles are observed, practical applications can be invented. TRL 2 is where a </w:t>
+      </w:r>
+      <w:r>
+        <w:rPr>
+          <w:i/>
+        </w:rPr>
+        <w:t>specific</w:t>
+      </w:r>
+      <w:r>
+        <w:t xml:space="preserve"> technology concept and its intended application are formulated — still speculative, with little or no experimental proof yet, but with the intended use, analytical reasoning and expected benefit written down. Turn the known principle into a defined, </w:t>
+      </w:r>
+      <w:r>
+        <w:rPr>
+          <w:i/>
+        </w:rPr>
+        <w:t>possible</w:t>
+      </w:r>
+      <w:r>
+        <w:t xml:space="preserve"> product concept: state what would be built, for whom, and against which requirements, even though nothing has been proven.</w:t>
+      </w:r>
+    </w:p>
+    <w:p>
+      <w:pPr>
+        <w:pStyle w:val="Kop2"/>
+      </w:pPr>
+      <w:r>
+        <w:t>What is normally done</w:t>
       </w:r>
     </w:p>
     <w:p>
@@ -831,7 +776,7 @@
         </w:numPr>
       </w:pPr>
       <w:r>
-        <w:t>Formulate the project scope, key results, and technical specification, split into must-have and nice-to-have requirements.</w:t>
+        <w:t>Define the concept and its intended use (the product idea and its application).</w:t>
       </w:r>
     </w:p>
     <w:p>
@@ -843,7 +788,7 @@
         </w:numPr>
       </w:pPr>
       <w:r>
-        <w:t>Perform an initial risk analysis and a scope-change analysis.</w:t>
+        <w:t>Formulate the project scope, key results, and technical specification, split into must-have and nice-to-have requirements.</w:t>
       </w:r>
     </w:p>
     <w:p>
@@ -855,134 +800,7 @@
         </w:numPr>
       </w:pPr>
       <w:r>
-        <w:t>Carry out market / component research: which suppliers and devices exist, at what price, and with what documentation quality.</w:t>
-      </w:r>
-    </w:p>
-    <w:p>
-      <w:pPr>
-        <w:pStyle w:val="Kop2"/>
-      </w:pPr>
-      <w:r>
-        <w:t>Environment &amp; fidelity</w:t>
-      </w:r>
-    </w:p>
-    <w:p>
-      <w:pPr/>
-      <w:r>
-        <w:t>Still analytical / on paper. The work consists of specifications, studies and comparisons rather than hardware.</w:t>
-      </w:r>
-    </w:p>
-    <w:p>
-      <w:pPr>
-        <w:pStyle w:val="Kop2"/>
-      </w:pPr>
-      <w:r>
-        <w:t>Typical output / evidence (exit criteria)</w:t>
-      </w:r>
-    </w:p>
-    <w:p>
-      <w:pPr/>
-      <w:r>
-        <w:t xml:space="preserve">A project/scope document, a written specification (requirements) list, and a market/component study. These let a reviewer answer </w:t>
-      </w:r>
-      <w:r>
-        <w:rPr>
-          <w:i/>
-        </w:rPr>
-        <w:t>"what could we build, and with which parts?"</w:t>
-      </w:r>
-      <w:r>
-        <w:t>.</w:t>
-      </w:r>
-    </w:p>
-    <w:p>
-      <w:pPr>
-        <w:pStyle w:val="Kop2"/>
-      </w:pPr>
-      <w:r>
-        <w:t>Common pitfalls</w:t>
-      </w:r>
-    </w:p>
-    <w:p>
-      <w:pPr/>
-      <w:r>
-        <w:t>Writing requirements that are not measurable; skipping the must-have / nice-to-have split; underestimating supplier lead-time or documentation-quality risk.</w:t>
-      </w:r>
-    </w:p>
-    <w:p>
-      <w:pPr>
-        <w:pStyle w:val="Kop2"/>
-      </w:pPr>
-      <w:r>
-        <w:t>How this applies to this repository</w:t>
-      </w:r>
-    </w:p>
-    <w:p>
-      <w:pPr/>
-      <w:r>
-        <w:t>TRL 2 is the first explicit task in the project scope. For the 400 A charger it is where the must-have specification is fixed (galvanic isolation AC↔DC, 400/500 A Powerlock 3P+PE, 600–800 VDC, liquid cooled, material cost &lt; €20 000, Modbus TCP, IEC 61439 / NEN 1010 / IEC 61000 compliance, C80 inrush) and where the module market study compares candidate converter modules and suppliers.</w:t>
-      </w:r>
-    </w:p>
-    <w:p>
-      <w:pPr/>
-    </w:p>
-    <w:p>
-      <w:r>
-        <w:br w:type="page"/>
-      </w:r>
-    </w:p>
-    <w:p>
-      <w:pPr>
-        <w:pStyle w:val="Kop1"/>
-      </w:pPr>
-      <w:r>
-        <w:t>TRL 3 — Experimental Proof of Concept</w:t>
-      </w:r>
-    </w:p>
-    <w:p>
-      <w:pPr/>
-      <w:r>
-        <w:t xml:space="preserve">TRL 3 is where active research and development begins. Analytical studies and/or small laboratory experiments are used to physically validate that the </w:t>
-      </w:r>
-      <w:r>
-        <w:rPr>
-          <w:i/>
-        </w:rPr>
-        <w:t>critical function</w:t>
-      </w:r>
-      <w:r>
-        <w:t xml:space="preserve"> or analytical prediction of the concept actually works. It proves the single riskiest element — not the whole system.</w:t>
-      </w:r>
-    </w:p>
-    <w:p>
-      <w:pPr>
-        <w:pStyle w:val="Kop2"/>
-      </w:pPr>
-      <w:r>
-        <w:t>Goal</w:t>
-      </w:r>
-    </w:p>
-    <w:p>
-      <w:pPr/>
-      <w:r>
-        <w:t xml:space="preserve">Prove that the </w:t>
-      </w:r>
-      <w:r>
-        <w:rPr>
-          <w:i/>
-        </w:rPr>
-        <w:t>critical function</w:t>
-      </w:r>
-      <w:r>
-        <w:t xml:space="preserve"> of the idea really works, analytically or with a small-scale test, and translate the concept into a first conceptual design.</w:t>
-      </w:r>
-    </w:p>
-    <w:p>
-      <w:pPr>
-        <w:pStyle w:val="Kop2"/>
-      </w:pPr>
-      <w:r>
-        <w:t>What is normally done</w:t>
+        <w:t>Perform an initial risk analysis and a scope-change analysis.</w:t>
       </w:r>
     </w:p>
     <w:p>
@@ -994,7 +812,7 @@
         </w:numPr>
       </w:pPr>
       <w:r>
-        <w:t>Analytical studies and/or small-scale lab experiments focused on the key risky element.</w:t>
+        <w:t>Carry out market / component research: which suppliers and devices exist, at what price, and with what documentation quality.</w:t>
       </w:r>
     </w:p>
     <w:p>
@@ -1006,7 +824,90 @@
         </w:numPr>
       </w:pPr>
       <w:r>
-        <w:t>Conceptual design: decide which components are required and show how they satisfy the scope.</w:t>
+        <w:t>Still analytical / on paper: the work consists of specifications, studies and comparisons rather than hardware.</w:t>
+      </w:r>
+    </w:p>
+    <w:p>
+      <w:pPr>
+        <w:pStyle w:val="Kop2"/>
+      </w:pPr>
+      <w:r>
+        <w:t>Typical output / evidence</w:t>
+      </w:r>
+    </w:p>
+    <w:p>
+      <w:pPr/>
+      <w:r>
+        <w:t xml:space="preserve">A project/scope document, a written specification (requirements) list, and a market/component study. These let a reviewer answer </w:t>
+      </w:r>
+      <w:r>
+        <w:rPr>
+          <w:i/>
+        </w:rPr>
+        <w:t>"what could we build, and with which parts?"</w:t>
+      </w:r>
+      <w:r>
+        <w:t>. Common pitfalls to avoid: writing requirements that are not measurable, skipping the must-have / nice-to-have split, and underestimating supplier lead-time or documentation-quality risk.</w:t>
+      </w:r>
+    </w:p>
+    <w:p>
+      <w:pPr/>
+    </w:p>
+    <w:p>
+      <w:pPr/>
+      <w:r>
+        <w:t>Note: In this repo, TRL 2 is the first explicit task in the project scope. For the 400 A charger it is where the must-have specification is fixed (galvanic isolation AC↔DC, 400/500 A Powerlock 3P+PE, 600–800 VDC, liquid cooled, material cost &lt; €20 000, Modbus TCP, IEC 61439 / NEN 1010 / IEC 61000 compliance, C80 inrush) and where the module market study compares candidate converter modules and suppliers.</w:t>
+      </w:r>
+    </w:p>
+    <w:p>
+      <w:pPr/>
+    </w:p>
+    <w:p>
+      <w:pPr>
+        <w:pStyle w:val="Kop1"/>
+      </w:pPr>
+      <w:r>
+        <w:t>TRL 3 — Experimental Proof of Concept</w:t>
+      </w:r>
+    </w:p>
+    <w:p>
+      <w:pPr>
+        <w:pStyle w:val="Kop2"/>
+      </w:pPr>
+      <w:r>
+        <w:t>Goal</w:t>
+      </w:r>
+    </w:p>
+    <w:p>
+      <w:pPr/>
+      <w:r>
+        <w:t xml:space="preserve">TRL 3 is where active research and development begins: analytical studies and/or small laboratory experiments physically validate that the </w:t>
+      </w:r>
+      <w:r>
+        <w:rPr>
+          <w:i/>
+        </w:rPr>
+        <w:t>critical function</w:t>
+      </w:r>
+      <w:r>
+        <w:t xml:space="preserve"> or analytical prediction of the concept actually works — proving the single riskiest element, not the whole system. Prove that the </w:t>
+      </w:r>
+      <w:r>
+        <w:rPr>
+          <w:i/>
+        </w:rPr>
+        <w:t>critical function</w:t>
+      </w:r>
+      <w:r>
+        <w:t xml:space="preserve"> of the idea really works, analytically or with a small-scale test, and translate the concept into a first conceptual design.</w:t>
+      </w:r>
+    </w:p>
+    <w:p>
+      <w:pPr>
+        <w:pStyle w:val="Kop2"/>
+      </w:pPr>
+      <w:r>
+        <w:t>What is normally done</w:t>
       </w:r>
     </w:p>
     <w:p>
@@ -1018,7 +919,7 @@
         </w:numPr>
       </w:pPr>
       <w:r>
-        <w:t>First engineering artefacts: single-line electrical diagram, mechanical concept description.</w:t>
+        <w:t>Analytical studies and/or small-scale lab experiments focused on the key risky element.</w:t>
       </w:r>
     </w:p>
     <w:p>
@@ -1030,125 +931,7 @@
         </w:numPr>
       </w:pPr>
       <w:r>
-        <w:t>Material cost estimate and a rough engineering/planning (hours, cost, schedule) estimate based on the concept.</w:t>
-      </w:r>
-    </w:p>
-    <w:p>
-      <w:pPr>
-        <w:pStyle w:val="Kop2"/>
-      </w:pPr>
-      <w:r>
-        <w:t>Environment &amp; fidelity</w:t>
-      </w:r>
-    </w:p>
-    <w:p>
-      <w:pPr/>
-      <w:r>
-        <w:t>Laboratory or analytical. Any hardware used is ad-hoc and not representative of the final product; the focus is on the proof, not on integration or packaging.</w:t>
-      </w:r>
-    </w:p>
-    <w:p>
-      <w:pPr>
-        <w:pStyle w:val="Kop2"/>
-      </w:pPr>
-      <w:r>
-        <w:t>Typical output / evidence (exit criteria)</w:t>
-      </w:r>
-    </w:p>
-    <w:p>
-      <w:pPr/>
-      <w:r>
-        <w:t xml:space="preserve">Proof-of-concept results (analysis or bench test), a conceptual design, a single-line diagram, and a cost/planning estimate. In this repo's flow the phase ends with a </w:t>
-      </w:r>
-      <w:r>
-        <w:rPr>
-          <w:b/>
-        </w:rPr>
-        <w:t>tollgate review</w:t>
-      </w:r>
-      <w:r>
-        <w:t>.</w:t>
-      </w:r>
-    </w:p>
-    <w:p>
-      <w:pPr>
-        <w:pStyle w:val="Kop2"/>
-      </w:pPr>
-      <w:r>
-        <w:t>Common pitfalls</w:t>
-      </w:r>
-    </w:p>
-    <w:p>
-      <w:pPr/>
-      <w:r>
-        <w:t>Proving an easy part while ignoring the real risk; conceptual designs that ignore cost, size or cooling constraints; optimistic hour estimates.</w:t>
-      </w:r>
-    </w:p>
-    <w:p>
-      <w:pPr>
-        <w:pStyle w:val="Kop2"/>
-      </w:pPr>
-      <w:r>
-        <w:t>How this applies to this repository</w:t>
-      </w:r>
-    </w:p>
-    <w:p>
-      <w:pPr/>
-      <w:r>
-        <w:t>TRL 3 is the conceptual-design task: selecting converter modules, drawing the single-line diagram, describing the mechanical layout inside the power-module envelope, and estimating material cost (target &lt; €20 000) and engineering hours. The tollgate decides whether the concept is worth detailed engineering.</w:t>
-      </w:r>
-    </w:p>
-    <w:p>
-      <w:pPr/>
-    </w:p>
-    <w:p>
-      <w:r>
-        <w:br w:type="page"/>
-      </w:r>
-    </w:p>
-    <w:p>
-      <w:pPr>
-        <w:pStyle w:val="Kop1"/>
-      </w:pPr>
-      <w:r>
-        <w:t>TRL 4 — Technology Validated in the Laboratory</w:t>
-      </w:r>
-    </w:p>
-    <w:p>
-      <w:pPr/>
-      <w:r>
-        <w:t>With the concept proven, the basic technological components are integrated to establish that they will work together. At TRL 4 this integration is "low fidelity" — a laboratory breadboard — compared with the eventual system. It is the first level where the pieces are combined rather than tested in isolation.</w:t>
-      </w:r>
-    </w:p>
-    <w:p>
-      <w:pPr>
-        <w:pStyle w:val="Kop2"/>
-      </w:pPr>
-      <w:r>
-        <w:t>Goal</w:t>
-      </w:r>
-    </w:p>
-    <w:p>
-      <w:pPr/>
-      <w:r>
-        <w:t xml:space="preserve">Show that the basic components function </w:t>
-      </w:r>
-      <w:r>
-        <w:rPr>
-          <w:i/>
-        </w:rPr>
-        <w:t>together</w:t>
-      </w:r>
-      <w:r>
-        <w:t xml:space="preserve"> (integration) in a controlled laboratory setting.</w:t>
-      </w:r>
-    </w:p>
-    <w:p>
-      <w:pPr>
-        <w:pStyle w:val="Kop2"/>
-      </w:pPr>
-      <w:r>
-        <w:t>What is normally done</w:t>
+        <w:t>Conceptual design: decide which components are required and show how they satisfy the scope.</w:t>
       </w:r>
     </w:p>
     <w:p>
@@ -1160,7 +943,7 @@
         </w:numPr>
       </w:pPr>
       <w:r>
-        <w:t>Build and test a simple prototype ("breadboard") that integrates the key components.</w:t>
+        <w:t>First engineering artefacts: single-line electrical diagram, mechanical concept description.</w:t>
       </w:r>
     </w:p>
     <w:p>
@@ -1172,7 +955,7 @@
         </w:numPr>
       </w:pPr>
       <w:r>
-        <w:t>Detailed design work begins in parallel (mechanical, electrical, software).</w:t>
+        <w:t>Material cost estimate and a rough engineering/planning (hours, cost, schedule) estimate based on the concept.</w:t>
       </w:r>
     </w:p>
     <w:p>
@@ -1184,7 +967,7 @@
         </w:numPr>
       </w:pPr>
       <w:r>
-        <w:t>Laboratory measurements confirm the combined parts behave as predicted.</w:t>
+        <w:t>Done in a laboratory or analytically; any hardware used is ad-hoc and not representative of the final product — the focus is on the proof, not on integration or packaging.</w:t>
       </w:r>
     </w:p>
     <w:p>
@@ -1192,13 +975,42 @@
         <w:pStyle w:val="Kop2"/>
       </w:pPr>
       <w:r>
-        <w:t>Environment &amp; fidelity</w:t>
-      </w:r>
-    </w:p>
-    <w:p>
-      <w:pPr/>
-      <w:r>
-        <w:t>Controlled laboratory. The breadboard is functional but not packaged, ruggedised or representative of the final form factor.</w:t>
+        <w:t>Typical output / evidence</w:t>
+      </w:r>
+    </w:p>
+    <w:p>
+      <w:pPr/>
+      <w:r>
+        <w:t xml:space="preserve">Proof-of-concept results (analysis or bench test), a conceptual design, a single-line diagram, and a cost/planning estimate. Ends with a </w:t>
+      </w:r>
+      <w:r>
+        <w:rPr>
+          <w:b/>
+        </w:rPr>
+        <w:t>tollgate review</w:t>
+      </w:r>
+      <w:r>
+        <w:t>. Common pitfalls to avoid: proving an easy part while ignoring the real risk, conceptual designs that ignore cost, size or cooling constraints, and optimistic hour estimates.</w:t>
+      </w:r>
+    </w:p>
+    <w:p>
+      <w:pPr/>
+    </w:p>
+    <w:p>
+      <w:pPr/>
+      <w:r>
+        <w:t>Note: In this repo, TRL 3 is the conceptual-design task: selecting converter modules, drawing the single-line diagram, describing the mechanical layout inside the power-module envelope, and estimating material cost (target &lt; €20 000) and engineering hours. The tollgate decides whether the concept is worth detailed engineering.</w:t>
+      </w:r>
+    </w:p>
+    <w:p>
+      <w:pPr/>
+    </w:p>
+    <w:p>
+      <w:pPr>
+        <w:pStyle w:val="Kop1"/>
+      </w:pPr>
+      <w:r>
+        <w:t>TRL 4 — Technology Validated in the Laboratory</w:t>
       </w:r>
     </w:p>
     <w:p>
@@ -1206,95 +1018,22 @@
         <w:pStyle w:val="Kop2"/>
       </w:pPr>
       <w:r>
-        <w:t>Typical output / evidence (exit criteria)</w:t>
-      </w:r>
-    </w:p>
-    <w:p>
-      <w:pPr/>
-      <w:r>
-        <w:t>Breadboard test results, the first detailed design drawings/schematics, and laboratory measurement reports.</w:t>
-      </w:r>
-    </w:p>
-    <w:p>
-      <w:pPr>
-        <w:pStyle w:val="Kop2"/>
-      </w:pPr>
-      <w:r>
-        <w:t>Common pitfalls</w:t>
-      </w:r>
-    </w:p>
-    <w:p>
-      <w:pPr/>
-      <w:r>
-        <w:t>Treating a tidy bench demo as if it were a relevant-environment test; deferring EMC, thermal and isolation questions that will dominate later levels.</w:t>
-      </w:r>
-    </w:p>
-    <w:p>
-      <w:pPr>
-        <w:pStyle w:val="Kop2"/>
-      </w:pPr>
-      <w:r>
-        <w:t>How this applies to this repository</w:t>
-      </w:r>
-    </w:p>
-    <w:p>
-      <w:pPr/>
-      <w:r>
-        <w:t>TRL 4 marks the start of detailed design. In this repo TRL 4 and 5 are handled together as one "detailed design" step, so TRL 4 covers the first integrated lab validation of the charger's power path (rectifier/PFC + isolated DC/DC + control) before it is exercised under realistic conditions.</w:t>
-      </w:r>
-    </w:p>
-    <w:p>
-      <w:pPr/>
-    </w:p>
-    <w:p>
-      <w:r>
-        <w:br w:type="page"/>
-      </w:r>
-    </w:p>
-    <w:p>
-      <w:pPr>
-        <w:pStyle w:val="Kop1"/>
-      </w:pPr>
-      <w:r>
-        <w:t>TRL 5 — Technology Validated in a Relevant Environment</w:t>
-      </w:r>
-    </w:p>
-    <w:p>
-      <w:pPr/>
-      <w:r>
-        <w:t xml:space="preserve">The fidelity of the breadboard increases significantly. At TRL 5 the integrated technology is tested in a </w:t>
+        <w:t>Goal</w:t>
+      </w:r>
+    </w:p>
+    <w:p>
+      <w:pPr/>
+      <w:r>
+        <w:t xml:space="preserve">With the concept proven, the basic technological components are integrated to establish that they will work together. At TRL 4 this integration is "low fidelity" — a laboratory breadboard compared with the eventual system — and it is the first level where the pieces are combined rather than tested in isolation. Show that the basic components function </w:t>
       </w:r>
       <w:r>
         <w:rPr>
           <w:i/>
         </w:rPr>
-        <w:t>relevant</w:t>
-      </w:r>
-      <w:r>
-        <w:t xml:space="preserve"> (realistic, though possibly simulated) environment, so that it is validated under conditions much closer to the real application — for key enabling technologies, an industrially relevant environment.</w:t>
-      </w:r>
-    </w:p>
-    <w:p>
-      <w:pPr>
-        <w:pStyle w:val="Kop2"/>
-      </w:pPr>
-      <w:r>
-        <w:t>Goal</w:t>
-      </w:r>
-    </w:p>
-    <w:p>
-      <w:pPr/>
-      <w:r>
-        <w:t xml:space="preserve">Increase fidelity — test the integrated technology under conditions that </w:t>
-      </w:r>
-      <w:r>
-        <w:rPr>
-          <w:i/>
-        </w:rPr>
-        <w:t>resemble</w:t>
-      </w:r>
-      <w:r>
-        <w:t xml:space="preserve"> real use (realistic loads, temperatures, vibration, EMC), not an ideal bench.</w:t>
+        <w:t>together</w:t>
+      </w:r>
+      <w:r>
+        <w:t xml:space="preserve"> (integration) in a controlled laboratory setting.</w:t>
       </w:r>
     </w:p>
     <w:p>
@@ -1314,7 +1053,7 @@
         </w:numPr>
       </w:pPr>
       <w:r>
-        <w:t>Test the prototype/subsystem in a simulated or relevant environment (realistic load, temperature, vibration, EMC conditions rather than an ideal bench).</w:t>
+        <w:t>Build and test a simple prototype ("breadboard") that integrates the key components.</w:t>
       </w:r>
     </w:p>
     <w:p>
@@ -1326,7 +1065,7 @@
         </w:numPr>
       </w:pPr>
       <w:r>
-        <w:t>Achieve more complete integration than at TRL 4.</w:t>
+        <w:t>Detailed design work begins in parallel (mechanical, electrical, software).</w:t>
       </w:r>
     </w:p>
     <w:p>
@@ -1338,7 +1077,7 @@
         </w:numPr>
       </w:pPr>
       <w:r>
-        <w:t>Complete the detailed engineering: galvanic isolation, EMC, inrush, cooling, envelope, weight.</w:t>
+        <w:t>Laboratory measurements confirm the combined parts behave as predicted.</w:t>
       </w:r>
     </w:p>
     <w:p>
@@ -1350,7 +1089,7 @@
         </w:numPr>
       </w:pPr>
       <w:r>
-        <w:t>Produce CE / compliance documentation, the build book and assembly instructions.</w:t>
+        <w:t>Done in a controlled laboratory; the breadboard is functional but not packaged, ruggedised or representative of the final form factor.</w:t>
       </w:r>
     </w:p>
     <w:p>
@@ -1358,13 +1097,33 @@
         <w:pStyle w:val="Kop2"/>
       </w:pPr>
       <w:r>
-        <w:t>Environment &amp; fidelity</w:t>
-      </w:r>
-    </w:p>
-    <w:p>
-      <w:pPr/>
-      <w:r>
-        <w:t>Relevant environment — realistic operating stresses applied, though possibly still on a test rig rather than the final installation.</w:t>
+        <w:t>Typical output / evidence</w:t>
+      </w:r>
+    </w:p>
+    <w:p>
+      <w:pPr/>
+      <w:r>
+        <w:t>Breadboard test results, the first detailed design drawings/schematics, and laboratory measurement reports. Common pitfalls to avoid: treating a tidy bench demo as if it were a relevant-environment test, and deferring EMC, thermal and isolation questions that will dominate later levels.</w:t>
+      </w:r>
+    </w:p>
+    <w:p>
+      <w:pPr/>
+    </w:p>
+    <w:p>
+      <w:pPr/>
+      <w:r>
+        <w:t>Note: In this repo, TRL 4 marks the start of detailed design. TRL 4 and 5 are handled together as one "detailed design" step, so TRL 4 covers the first integrated lab validation of the charger's power path (rectifier/PFC + isolated DC/DC + control) before it is exercised under realistic conditions.</w:t>
+      </w:r>
+    </w:p>
+    <w:p>
+      <w:pPr/>
+    </w:p>
+    <w:p>
+      <w:pPr>
+        <w:pStyle w:val="Kop1"/>
+      </w:pPr>
+      <w:r>
+        <w:t>TRL 5 — Technology Validated in a Relevant Environment</w:t>
       </w:r>
     </w:p>
     <w:p>
@@ -1372,86 +1131,31 @@
         <w:pStyle w:val="Kop2"/>
       </w:pPr>
       <w:r>
-        <w:t>Typical output / evidence (exit criteria)</w:t>
-      </w:r>
-    </w:p>
-    <w:p>
-      <w:pPr/>
-      <w:r>
-        <w:t xml:space="preserve">Validation results obtained in a relevant environment, a complete detailed design package, and draft CE documentation. (In this repo TRL 4 and 5 are handled together as "detailed design".) Ends with a </w:t>
+        <w:t>Goal</w:t>
+      </w:r>
+    </w:p>
+    <w:p>
+      <w:pPr/>
+      <w:r>
+        <w:t xml:space="preserve">The fidelity of the breadboard increases significantly. At TRL 5 the integrated technology is tested in a </w:t>
       </w:r>
       <w:r>
         <w:rPr>
-          <w:b/>
+          <w:i/>
         </w:rPr>
-        <w:t>tollgate review</w:t>
-      </w:r>
-      <w:r>
-        <w:t>.</w:t>
-      </w:r>
-    </w:p>
-    <w:p>
-      <w:pPr>
-        <w:pStyle w:val="Kop2"/>
-      </w:pPr>
-      <w:r>
-        <w:t>Common pitfalls</w:t>
-      </w:r>
-    </w:p>
-    <w:p>
-      <w:pPr/>
-      <w:r>
-        <w:t>Declaring success from a single nominal-condition test; leaving compliance (CE, IEC 61439, EMC IEC 61000) documentation until after the hardware is frozen.</w:t>
-      </w:r>
-    </w:p>
-    <w:p>
-      <w:pPr>
-        <w:pStyle w:val="Kop2"/>
-      </w:pPr>
-      <w:r>
-        <w:t>How this applies to this repository</w:t>
-      </w:r>
-    </w:p>
-    <w:p>
-      <w:pPr/>
-      <w:r>
-        <w:t>TRL 5 completes detailed design for the charger: liquid-cooling sizing (total heat &lt; 7 kW, efficiency &gt; 97.5 %), galvanic isolation, C-type inrush behaviour, weight (&lt; 500 kg) and envelope (within the power-module size), plus the CE dossier and build book. It feeds directly into the prototype build.</w:t>
-      </w:r>
-    </w:p>
-    <w:p>
-      <w:pPr/>
-    </w:p>
-    <w:p>
-      <w:r>
-        <w:br w:type="page"/>
-      </w:r>
-    </w:p>
-    <w:p>
-      <w:pPr>
-        <w:pStyle w:val="Kop1"/>
-      </w:pPr>
-      <w:r>
-        <w:t>TRL 6 — Technology Demonstrated in a Relevant Environment</w:t>
-      </w:r>
-    </w:p>
-    <w:p>
-      <w:pPr/>
-      <w:r>
-        <w:t>TRL 6 is a major step up: a representative model or full system/subsystem prototype is built and demonstrated in a relevant environment. The prototype is well beyond the breadboard of TRL 5 and is close to the final configuration in form, fit and function.</w:t>
-      </w:r>
-    </w:p>
-    <w:p>
-      <w:pPr>
-        <w:pStyle w:val="Kop2"/>
-      </w:pPr>
-      <w:r>
-        <w:t>Goal</w:t>
-      </w:r>
-    </w:p>
-    <w:p>
-      <w:pPr/>
-      <w:r>
-        <w:t>Demonstrate a full system/subsystem prototype in a relevant environment, validated against the must-have criteria.</w:t>
+        <w:t>relevant</w:t>
+      </w:r>
+      <w:r>
+        <w:t xml:space="preserve"> (realistic, though possibly simulated) environment, so that it is validated under conditions much closer to the real application — for key enabling technologies, an industrially relevant environment. Increase fidelity: test the integrated technology under conditions that </w:t>
+      </w:r>
+      <w:r>
+        <w:rPr>
+          <w:i/>
+        </w:rPr>
+        <w:t>resemble</w:t>
+      </w:r>
+      <w:r>
+        <w:t xml:space="preserve"> real use (realistic loads, temperatures, vibration, EMC), not an ideal bench.</w:t>
       </w:r>
     </w:p>
     <w:p>
@@ -1471,7 +1175,16 @@
         </w:numPr>
       </w:pPr>
       <w:r>
-        <w:t>Build the prototype (proto build).</w:t>
+        <w:t xml:space="preserve">Test the prototype/subsystem in a simulated or </w:t>
+      </w:r>
+      <w:r>
+        <w:rPr>
+          <w:i/>
+        </w:rPr>
+        <w:t>relevant</w:t>
+      </w:r>
+      <w:r>
+        <w:t xml:space="preserve"> environment (realistic load, temperature, vibration, EMC conditions rather than an ideal bench).</w:t>
       </w:r>
     </w:p>
     <w:p>
@@ -1483,7 +1196,7 @@
         </w:numPr>
       </w:pPr>
       <w:r>
-        <w:t>Functional testing and performance validation against the must-have criteria.</w:t>
+        <w:t>Achieve more complete integration than at TRL 4.</w:t>
       </w:r>
     </w:p>
     <w:p>
@@ -1495,134 +1208,7 @@
         </w:numPr>
       </w:pPr>
       <w:r>
-        <w:t>Verify the key behaviours (EMC, inrush current, thermal behaviour, ingress protection, efficiency, control interface).</w:t>
-      </w:r>
-    </w:p>
-    <w:p>
-      <w:pPr>
-        <w:pStyle w:val="Kop2"/>
-      </w:pPr>
-      <w:r>
-        <w:t>Environment &amp; fidelity</w:t>
-      </w:r>
-    </w:p>
-    <w:p>
-      <w:pPr/>
-      <w:r>
-        <w:t>Relevant environment with a near-representative prototype — much higher fidelity than TRL 5, exercising the real power levels and interfaces.</w:t>
-      </w:r>
-    </w:p>
-    <w:p>
-      <w:pPr>
-        <w:pStyle w:val="Kop2"/>
-      </w:pPr>
-      <w:r>
-        <w:t>Typical output / evidence (exit criteria)</w:t>
-      </w:r>
-    </w:p>
-    <w:p>
-      <w:pPr/>
-      <w:r>
-        <w:t xml:space="preserve">A working prototype, a functional test report, and a performance validation against requirements — exactly what a </w:t>
-      </w:r>
-      <w:r>
-        <w:rPr>
-          <w:i/>
-        </w:rPr>
-        <w:t>measurement / verification plan</w:t>
-      </w:r>
-      <w:r>
-        <w:t xml:space="preserve"> checks off. Ends with a </w:t>
-      </w:r>
-      <w:r>
-        <w:rPr>
-          <w:b/>
-        </w:rPr>
-        <w:t>tollgate review</w:t>
-      </w:r>
-      <w:r>
-        <w:t>.</w:t>
-      </w:r>
-    </w:p>
-    <w:p>
-      <w:pPr>
-        <w:pStyle w:val="Kop2"/>
-      </w:pPr>
-      <w:r>
-        <w:t>Common pitfalls</w:t>
-      </w:r>
-    </w:p>
-    <w:p>
-      <w:pPr/>
-      <w:r>
-        <w:t>Testing only a subset of requirements; no traceable pass/fail matrix; skipping worst-case (maximum power, maximum temperature) points.</w:t>
-      </w:r>
-    </w:p>
-    <w:p>
-      <w:pPr>
-        <w:pStyle w:val="Kop2"/>
-      </w:pPr>
-      <w:r>
-        <w:t>How this applies to this repository</w:t>
-      </w:r>
-    </w:p>
-    <w:p>
-      <w:pPr/>
-      <w:r>
-        <w:t>TRL 6 is the testing task. The e-PU Cabinet V2 Measurement Plan is the TRL 6 instrument: it lists every requirement and records that the prototype was measured and passes (power, efficiency, isolation, EMC, inrush, cooling, Modbus TCP control, etc.).</w:t>
-      </w:r>
-    </w:p>
-    <w:p>
-      <w:pPr/>
-    </w:p>
-    <w:p>
-      <w:r>
-        <w:br w:type="page"/>
-      </w:r>
-    </w:p>
-    <w:p>
-      <w:pPr>
-        <w:pStyle w:val="Kop1"/>
-      </w:pPr>
-      <w:r>
-        <w:t>TRL 7 — System Prototype Demonstration in an Operational Environment</w:t>
-      </w:r>
-    </w:p>
-    <w:p>
-      <w:pPr/>
-      <w:r>
-        <w:t xml:space="preserve">TRL 7 requires demonstration of a near-final ("system prototype") in the </w:t>
-      </w:r>
-      <w:r>
-        <w:rPr>
-          <w:i/>
-        </w:rPr>
-        <w:t>operational</w:t>
-      </w:r>
-      <w:r>
-        <w:t xml:space="preserve"> environment — the real setting in which the product will be used. It differs from TRL 6 in that the environment is the actual operational one, not a relevant/simulated one.</w:t>
-      </w:r>
-    </w:p>
-    <w:p>
-      <w:pPr>
-        <w:pStyle w:val="Kop2"/>
-      </w:pPr>
-      <w:r>
-        <w:t>Goal</w:t>
-      </w:r>
-    </w:p>
-    <w:p>
-      <w:pPr/>
-      <w:r>
-        <w:t>Demonstrate a near-final prototype in the actual operational environment.</w:t>
-      </w:r>
-    </w:p>
-    <w:p>
-      <w:pPr>
-        <w:pStyle w:val="Kop2"/>
-      </w:pPr>
-      <w:r>
-        <w:t>What is normally done</w:t>
+        <w:t>Complete the detailed engineering: galvanic isolation, EMC, inrush, cooling, envelope, weight.</w:t>
       </w:r>
     </w:p>
     <w:p>
@@ -1634,7 +1220,7 @@
         </w:numPr>
       </w:pPr>
       <w:r>
-        <w:t>Field trials / pilot installation in the real operating setting (installed on site, connected to the real grid or microgrid).</w:t>
+        <w:t>Produce CE / compliance documentation, the build book and assembly instructions.</w:t>
       </w:r>
     </w:p>
     <w:p>
@@ -1646,7 +1232,7 @@
         </w:numPr>
       </w:pPr>
       <w:r>
-        <w:t>Full-scale operational testing under real-world conditions and duty cycles.</w:t>
+        <w:t>Realistic operating stresses are applied, though possibly still on a test rig rather than the final installation.</w:t>
       </w:r>
     </w:p>
     <w:p>
@@ -1654,13 +1240,42 @@
         <w:pStyle w:val="Kop2"/>
       </w:pPr>
       <w:r>
-        <w:t>Environment &amp; fidelity</w:t>
-      </w:r>
-    </w:p>
-    <w:p>
-      <w:pPr/>
-      <w:r>
-        <w:t>Operational environment — the real installation, real grid/microgrid, real thermal and duty conditions. Fidelity is essentially final.</w:t>
+        <w:t>Typical output / evidence</w:t>
+      </w:r>
+    </w:p>
+    <w:p>
+      <w:pPr/>
+      <w:r>
+        <w:t xml:space="preserve">Validation results obtained in a relevant environment, a complete detailed design package, and draft CE documentation. (In this repo TRL 4 and 5 are handled together as "detailed design".) Ends with a </w:t>
+      </w:r>
+      <w:r>
+        <w:rPr>
+          <w:b/>
+        </w:rPr>
+        <w:t>tollgate review</w:t>
+      </w:r>
+      <w:r>
+        <w:t>. Common pitfalls to avoid: declaring success from a single nominal-condition test, and leaving compliance (CE, IEC 61439, EMC IEC 61000) documentation until after the hardware is frozen.</w:t>
+      </w:r>
+    </w:p>
+    <w:p>
+      <w:pPr/>
+    </w:p>
+    <w:p>
+      <w:pPr/>
+      <w:r>
+        <w:t>Note: In this repo, TRL 5 completes detailed design for the charger: liquid-cooling sizing (total heat &lt; 7 kW, efficiency &gt; 97.5 %), galvanic isolation, C-type inrush behaviour, weight (&lt; 500 kg) and envelope (within the power-module size), plus the CE dossier and build book. It feeds directly into the prototype build.</w:t>
+      </w:r>
+    </w:p>
+    <w:p>
+      <w:pPr/>
+    </w:p>
+    <w:p>
+      <w:pPr>
+        <w:pStyle w:val="Kop1"/>
+      </w:pPr>
+      <w:r>
+        <w:t>TRL 6 — Technology Demonstrated in a Relevant Environment</w:t>
       </w:r>
     </w:p>
     <w:p>
@@ -1668,86 +1283,22 @@
         <w:pStyle w:val="Kop2"/>
       </w:pPr>
       <w:r>
-        <w:t>Typical output / evidence (exit criteria)</w:t>
-      </w:r>
-    </w:p>
-    <w:p>
-      <w:pPr/>
-      <w:r>
-        <w:t>Field/pilot test results and an operational demonstration report from the real site.</w:t>
-      </w:r>
-    </w:p>
-    <w:p>
-      <w:pPr>
-        <w:pStyle w:val="Kop2"/>
-      </w:pPr>
-      <w:r>
-        <w:t>Common pitfalls</w:t>
-      </w:r>
-    </w:p>
-    <w:p>
-      <w:pPr/>
-      <w:r>
-        <w:t>Assuming a lab-passed prototype will behave identically on a real microgrid (earthing, harmonics, ambient); insufficient monitoring during the pilot.</w:t>
-      </w:r>
-    </w:p>
-    <w:p>
-      <w:pPr>
-        <w:pStyle w:val="Kop2"/>
-      </w:pPr>
-      <w:r>
-        <w:t>How this applies to this repository</w:t>
-      </w:r>
-    </w:p>
-    <w:p>
-      <w:pPr/>
-      <w:r>
-        <w:t>The projects here often move directly from TRL 6 (prototype test) to TRL 8 (sales readiness), so TRL 7 is not always an explicit task. It is where an on-site operational pilot of the charger in an e-PU10 microgrid would sit — validating the &gt; 98 % uptime and serviceability goals under real conditions — if such a pilot is run.</w:t>
-      </w:r>
-    </w:p>
-    <w:p>
-      <w:pPr/>
-    </w:p>
-    <w:p>
-      <w:r>
-        <w:br w:type="page"/>
-      </w:r>
-    </w:p>
-    <w:p>
-      <w:pPr>
-        <w:pStyle w:val="Kop1"/>
-      </w:pPr>
-      <w:r>
-        <w:t>TRL 8 — Actual System Completed and Qualified</w:t>
-      </w:r>
-    </w:p>
-    <w:p>
-      <w:pPr/>
-      <w:r>
-        <w:t xml:space="preserve">The technology has been proven to work in its final form and under the expected conditions. At TRL 8 the actual system is completed and </w:t>
+        <w:t>Goal</w:t>
+      </w:r>
+    </w:p>
+    <w:p>
+      <w:pPr/>
+      <w:r>
+        <w:t xml:space="preserve">TRL 6 is a major step up: a representative model or full </w:t>
       </w:r>
       <w:r>
         <w:rPr>
-          <w:i/>
+          <w:b/>
         </w:rPr>
-        <w:t>qualified</w:t>
-      </w:r>
-      <w:r>
-        <w:t xml:space="preserve"> through test and demonstration; in almost all cases this is the end of true system development.</w:t>
-      </w:r>
-    </w:p>
-    <w:p>
-      <w:pPr>
-        <w:pStyle w:val="Kop2"/>
-      </w:pPr>
-      <w:r>
-        <w:t>Goal</w:t>
-      </w:r>
-    </w:p>
-    <w:p>
-      <w:pPr/>
-      <w:r>
-        <w:t>Reach the final form — fully tested, qualified and certified, and ready to be offered commercially.</w:t>
+        <w:t>system/subsystem prototype</w:t>
+      </w:r>
+      <w:r>
+        <w:t xml:space="preserve"> is built and demonstrated in a relevant environment. The prototype is well beyond the breadboard of TRL 5 and is close to the final configuration in form, fit and function. Demonstrate a full system/subsystem prototype in a relevant environment, validated against the must-have criteria.</w:t>
       </w:r>
     </w:p>
     <w:p>
@@ -1767,7 +1318,7 @@
         </w:numPr>
       </w:pPr>
       <w:r>
-        <w:t>Final product and process qualification.</w:t>
+        <w:t>Build the prototype (proto build).</w:t>
       </w:r>
     </w:p>
     <w:p>
@@ -1779,7 +1330,7 @@
         </w:numPr>
       </w:pPr>
       <w:r>
-        <w:t>Certification / compliance sign-off (e.g. CE marking).</w:t>
+        <w:t>Functional testing and performance validation against the must-have criteria.</w:t>
       </w:r>
     </w:p>
     <w:p>
@@ -1791,7 +1342,7 @@
         </w:numPr>
       </w:pPr>
       <w:r>
-        <w:t>Full integration and pre-commercial preparation.</w:t>
+        <w:t>Verify the key behaviours (EMC, inrush current, thermal behaviour, ingress protection, efficiency, control interface).</w:t>
       </w:r>
     </w:p>
     <w:p>
@@ -1803,7 +1354,7 @@
         </w:numPr>
       </w:pPr>
       <w:r>
-        <w:t>Commercial preparation: sales one-pager, technical datasheet.</w:t>
+        <w:t>Done in a relevant environment with a near-representative prototype — much higher fidelity than TRL 5, exercising the real power levels and interfaces.</w:t>
       </w:r>
     </w:p>
     <w:p>
@@ -1811,27 +1362,22 @@
         <w:pStyle w:val="Kop2"/>
       </w:pPr>
       <w:r>
-        <w:t>Environment &amp; fidelity</w:t>
-      </w:r>
-    </w:p>
-    <w:p>
-      <w:pPr/>
-      <w:r>
-        <w:t>Final form in the operational configuration; the product is the real thing, qualified against its specification and standards.</w:t>
-      </w:r>
-    </w:p>
-    <w:p>
-      <w:pPr>
-        <w:pStyle w:val="Kop2"/>
-      </w:pPr>
-      <w:r>
-        <w:t>Typical output / evidence (exit criteria)</w:t>
-      </w:r>
-    </w:p>
-    <w:p>
-      <w:pPr/>
-      <w:r>
-        <w:t xml:space="preserve">Qualification/certification records, a technical datasheet and a sales one-pager. Ends with a </w:t>
+        <w:t>Typical output / evidence</w:t>
+      </w:r>
+    </w:p>
+    <w:p>
+      <w:pPr/>
+      <w:r>
+        <w:t xml:space="preserve">A working prototype, a functional test report, and a performance validation against requirements — exactly what a </w:t>
+      </w:r>
+      <w:r>
+        <w:rPr>
+          <w:i/>
+        </w:rPr>
+        <w:t>measurement / verification plan</w:t>
+      </w:r>
+      <w:r>
+        <w:t xml:space="preserve"> checks off. Ends with a </w:t>
       </w:r>
       <w:r>
         <w:rPr>
@@ -1840,71 +1386,59 @@
         <w:t>tollgate review</w:t>
       </w:r>
       <w:r>
+        <w:t>. Common pitfalls to avoid: testing only a subset of requirements, having no traceable pass/fail matrix, and skipping worst-case (maximum power, maximum temperature) points.</w:t>
+      </w:r>
+    </w:p>
+    <w:p>
+      <w:pPr/>
+    </w:p>
+    <w:p>
+      <w:pPr/>
+      <w:r>
+        <w:t>Note: In this repo, TRL 6 is the testing task. The e-PU Cabinet V2 Measurement Plan is the TRL 6 instrument: it lists every requirement and records that the prototype was measured and passes (power, efficiency, isolation, EMC, inrush, cooling, Modbus TCP control, etc.).</w:t>
+      </w:r>
+    </w:p>
+    <w:p>
+      <w:pPr/>
+    </w:p>
+    <w:p>
+      <w:pPr>
+        <w:pStyle w:val="Kop1"/>
+      </w:pPr>
+      <w:r>
+        <w:t>TRL 7 — System Prototype Demonstration in an Operational Environment</w:t>
+      </w:r>
+    </w:p>
+    <w:p>
+      <w:pPr>
+        <w:pStyle w:val="Kop2"/>
+      </w:pPr>
+      <w:r>
+        <w:t>Goal</w:t>
+      </w:r>
+    </w:p>
+    <w:p>
+      <w:pPr/>
+      <w:r>
+        <w:t xml:space="preserve">TRL 7 requires demonstration of a near-final ("system prototype") in the </w:t>
+      </w:r>
+      <w:r>
+        <w:rPr>
+          <w:i/>
+        </w:rPr>
+        <w:t>operational</w:t>
+      </w:r>
+      <w:r>
+        <w:t xml:space="preserve"> environment — the real setting in which the product will be used. It differs from TRL 6 in that the environment is the actual operational one, not a relevant/simulated one. Demonstrate a near-final prototype in the </w:t>
+      </w:r>
+      <w:r>
+        <w:rPr>
+          <w:b/>
+        </w:rPr>
+        <w:t>actual operational environment</w:t>
+      </w:r>
+      <w:r>
         <w:t>.</w:t>
-      </w:r>
-    </w:p>
-    <w:p>
-      <w:pPr>
-        <w:pStyle w:val="Kop2"/>
-      </w:pPr>
-      <w:r>
-        <w:t>Common pitfalls</w:t>
-      </w:r>
-    </w:p>
-    <w:p>
-      <w:pPr/>
-      <w:r>
-        <w:t>Treating certification as a formality; datasheet figures that don't match the qualified test results; missing traceability from requirement → test → certificate.</w:t>
-      </w:r>
-    </w:p>
-    <w:p>
-      <w:pPr>
-        <w:pStyle w:val="Kop2"/>
-      </w:pPr>
-      <w:r>
-        <w:t>How this applies to this repository</w:t>
-      </w:r>
-    </w:p>
-    <w:p>
-      <w:pPr/>
-      <w:r>
-        <w:t>TRL 8 is the "create one-pager for sales" task. For the charger it means the CE-marked, qualified 400 A unit with a datasheet reflecting the verified specification (power, efficiency, isolation, cost, interfaces) ready to present to customers.</w:t>
-      </w:r>
-    </w:p>
-    <w:p>
-      <w:pPr/>
-    </w:p>
-    <w:p>
-      <w:r>
-        <w:br w:type="page"/>
-      </w:r>
-    </w:p>
-    <w:p>
-      <w:pPr>
-        <w:pStyle w:val="Kop1"/>
-      </w:pPr>
-      <w:r>
-        <w:t>TRL 9 — Actual System Proven Through Successful Operations</w:t>
-      </w:r>
-    </w:p>
-    <w:p>
-      <w:pPr/>
-      <w:r>
-        <w:t>TRL 9 is the highest level: the actual system is proven through successful operation. The technology is applied in its final form and under real, routine operating conditions, and is no longer under development — only in-service monitoring and improvement remain.</w:t>
-      </w:r>
-    </w:p>
-    <w:p>
-      <w:pPr>
-        <w:pStyle w:val="Kop2"/>
-      </w:pPr>
-      <w:r>
-        <w:t>Goal</w:t>
-      </w:r>
-    </w:p>
-    <w:p>
-      <w:pPr/>
-      <w:r>
-        <w:t>The technology is in real, routine operational use and proven reliable, and is released as a series product.</w:t>
       </w:r>
     </w:p>
     <w:p>
@@ -1924,7 +1458,7 @@
         </w:numPr>
       </w:pPr>
       <w:r>
-        <w:t>Finalize and update all documentation.</w:t>
+        <w:t>Field trials / pilot installation in the real operating setting (installed on site, connected to the real grid or microgrid).</w:t>
       </w:r>
     </w:p>
     <w:p>
@@ -1936,7 +1470,7 @@
         </w:numPr>
       </w:pPr>
       <w:r>
-        <w:t>Make the product series-ready (production-ready).</w:t>
+        <w:t>Full-scale operational testing under real-world conditions and duty cycles.</w:t>
       </w:r>
     </w:p>
     <w:p>
@@ -1948,7 +1482,81 @@
         </w:numPr>
       </w:pPr>
       <w:r>
-        <w:t>Transfer the product to the sales matrix / into production.</w:t>
+        <w:t>Done in the operational environment — real installation, real grid/microgrid, real thermal and duty conditions; fidelity is essentially final.</w:t>
+      </w:r>
+    </w:p>
+    <w:p>
+      <w:pPr>
+        <w:pStyle w:val="Kop2"/>
+      </w:pPr>
+      <w:r>
+        <w:t>Typical output / evidence</w:t>
+      </w:r>
+    </w:p>
+    <w:p>
+      <w:pPr/>
+      <w:r>
+        <w:t>Field/pilot test results and an operational demonstration report from the real site. Common pitfalls to avoid: assuming a lab-passed prototype will behave identically on a real microgrid (earthing, harmonics, ambient), and insufficient monitoring during the pilot.</w:t>
+      </w:r>
+    </w:p>
+    <w:p>
+      <w:pPr/>
+    </w:p>
+    <w:p>
+      <w:pPr/>
+      <w:r>
+        <w:t>Note: The projects in this repo often move directly from TRL 6 (prototype test) to TRL 8 (sales readiness), so TRL 7 is not always an explicit task. It is where an on-site operational pilot of the charger in an e-PU10 microgrid would sit — validating the &gt; 98 % uptime and serviceability goals under real conditions — if such a pilot is run.</w:t>
+      </w:r>
+    </w:p>
+    <w:p>
+      <w:pPr/>
+    </w:p>
+    <w:p>
+      <w:pPr>
+        <w:pStyle w:val="Kop1"/>
+      </w:pPr>
+      <w:r>
+        <w:t>TRL 8 — Actual System Completed and Qualified</w:t>
+      </w:r>
+    </w:p>
+    <w:p>
+      <w:pPr>
+        <w:pStyle w:val="Kop2"/>
+      </w:pPr>
+      <w:r>
+        <w:t>Goal</w:t>
+      </w:r>
+    </w:p>
+    <w:p>
+      <w:pPr/>
+      <w:r>
+        <w:t xml:space="preserve">The technology has been proven to work in its final form and under the expected conditions. At TRL 8 the actual system is completed and </w:t>
+      </w:r>
+      <w:r>
+        <w:rPr>
+          <w:i/>
+        </w:rPr>
+        <w:t>qualified</w:t>
+      </w:r>
+      <w:r>
+        <w:t xml:space="preserve"> through test and demonstration; in almost all cases this is the end of true system development. Reach the </w:t>
+      </w:r>
+      <w:r>
+        <w:rPr>
+          <w:b/>
+        </w:rPr>
+        <w:t>final form</w:t>
+      </w:r>
+      <w:r>
+        <w:t xml:space="preserve"> — fully tested, qualified and certified, and ready to be offered commercially.</w:t>
+      </w:r>
+    </w:p>
+    <w:p>
+      <w:pPr>
+        <w:pStyle w:val="Kop2"/>
+      </w:pPr>
+      <w:r>
+        <w:t>What is normally done</w:t>
       </w:r>
     </w:p>
     <w:p>
@@ -1960,7 +1568,55 @@
         </w:numPr>
       </w:pPr>
       <w:r>
-        <w:t>Ongoing monitoring and maintenance.</w:t>
+        <w:t>Final product and process qualification.</w:t>
+      </w:r>
+    </w:p>
+    <w:p>
+      <w:pPr>
+        <w:pStyle w:val="Lijstalinea"/>
+        <w:numPr>
+          <w:ilvl w:val="0"/>
+          <w:numId w:val="1"/>
+        </w:numPr>
+      </w:pPr>
+      <w:r>
+        <w:t>Certification / compliance sign-off (e.g. CE marking).</w:t>
+      </w:r>
+    </w:p>
+    <w:p>
+      <w:pPr>
+        <w:pStyle w:val="Lijstalinea"/>
+        <w:numPr>
+          <w:ilvl w:val="0"/>
+          <w:numId w:val="1"/>
+        </w:numPr>
+      </w:pPr>
+      <w:r>
+        <w:t>Full integration and pre-commercial preparation.</w:t>
+      </w:r>
+    </w:p>
+    <w:p>
+      <w:pPr>
+        <w:pStyle w:val="Lijstalinea"/>
+        <w:numPr>
+          <w:ilvl w:val="0"/>
+          <w:numId w:val="1"/>
+        </w:numPr>
+      </w:pPr>
+      <w:r>
+        <w:t>Commercial preparation: sales one-pager, technical datasheet.</w:t>
+      </w:r>
+    </w:p>
+    <w:p>
+      <w:pPr>
+        <w:pStyle w:val="Lijstalinea"/>
+        <w:numPr>
+          <w:ilvl w:val="0"/>
+          <w:numId w:val="1"/>
+        </w:numPr>
+      </w:pPr>
+      <w:r>
+        <w:t>The product is now the real thing in its final, operational configuration, qualified against its specification and standards.</w:t>
       </w:r>
     </w:p>
     <w:p>
@@ -1968,27 +1624,13 @@
         <w:pStyle w:val="Kop2"/>
       </w:pPr>
       <w:r>
-        <w:t>Environment &amp; fidelity</w:t>
-      </w:r>
-    </w:p>
-    <w:p>
-      <w:pPr/>
-      <w:r>
-        <w:t>Live operation / series production — the real product, in real use, at production quality.</w:t>
-      </w:r>
-    </w:p>
-    <w:p>
-      <w:pPr>
-        <w:pStyle w:val="Kop2"/>
-      </w:pPr>
-      <w:r>
-        <w:t>Typical output / evidence (exit criteria)</w:t>
-      </w:r>
-    </w:p>
-    <w:p>
-      <w:pPr/>
-      <w:r>
-        <w:t xml:space="preserve">A released, series-ready product; final documentation; the product in the sales catalogue; and field reliability data. Ends with a final acceptance </w:t>
+        <w:t>Typical output / evidence</w:t>
+      </w:r>
+    </w:p>
+    <w:p>
+      <w:pPr/>
+      <w:r>
+        <w:t xml:space="preserve">Qualification/certification records, a technical datasheet and a sales one-pager. Ends with a </w:t>
       </w:r>
       <w:r>
         <w:rPr>
@@ -1997,7 +1639,27 @@
         <w:t>tollgate review</w:t>
       </w:r>
       <w:r>
-        <w:t>.</w:t>
+        <w:t>. Common pitfalls to avoid: treating certification as a formality, datasheet figures that don't match the qualified test results, and missing traceability from requirement → test → certificate.</w:t>
+      </w:r>
+    </w:p>
+    <w:p>
+      <w:pPr/>
+    </w:p>
+    <w:p>
+      <w:pPr/>
+      <w:r>
+        <w:t>Note: In this repo, TRL 8 is the "create one-pager for sales" task. For the charger it means the CE-marked, qualified 400 A unit with a datasheet reflecting the verified specification (power, efficiency, isolation, cost, interfaces) ready to present to customers.</w:t>
+      </w:r>
+    </w:p>
+    <w:p>
+      <w:pPr/>
+    </w:p>
+    <w:p>
+      <w:pPr>
+        <w:pStyle w:val="Kop1"/>
+      </w:pPr>
+      <w:r>
+        <w:t>TRL 9 — Actual System Proven Through Successful Operations</w:t>
       </w:r>
     </w:p>
     <w:p>
@@ -2005,13 +1667,22 @@
         <w:pStyle w:val="Kop2"/>
       </w:pPr>
       <w:r>
-        <w:t>Common pitfalls</w:t>
-      </w:r>
-    </w:p>
-    <w:p>
-      <w:pPr/>
-      <w:r>
-        <w:t>Declaring TRL 9 from a single successful install rather than proven routine operation; letting documentation drift out of date once the product ships; no feedback loop from field data into maintenance.</w:t>
+        <w:t>Goal</w:t>
+      </w:r>
+    </w:p>
+    <w:p>
+      <w:pPr/>
+      <w:r>
+        <w:t xml:space="preserve">TRL 9 is the highest level: the actual system is proven through successful operation. The technology is applied in its final form and under real, routine operating conditions, and is no longer under development — only in-service monitoring and improvement remain. The technology is in </w:t>
+      </w:r>
+      <w:r>
+        <w:rPr>
+          <w:b/>
+        </w:rPr>
+        <w:t>real, routine operational use</w:t>
+      </w:r>
+      <w:r>
+        <w:t xml:space="preserve"> and proven reliable, and is released as a series product.</w:t>
       </w:r>
     </w:p>
     <w:p>
@@ -2019,13 +1690,99 @@
         <w:pStyle w:val="Kop2"/>
       </w:pPr>
       <w:r>
-        <w:t>How this applies to this repository</w:t>
-      </w:r>
-    </w:p>
-    <w:p>
-      <w:pPr/>
-      <w:r>
-        <w:t>TRL 9 is the "finalize product and transfer to sales matrix" task. For the 400 A charger and the e-PU Cabinet V2 BESS it means the production-ready unit, complete documentation, and the product in VDL Energy Systems' sales matrix, with field uptime (&gt; 98 %) monitored in service.</w:t>
+        <w:t>What is normally done</w:t>
+      </w:r>
+    </w:p>
+    <w:p>
+      <w:pPr>
+        <w:pStyle w:val="Lijstalinea"/>
+        <w:numPr>
+          <w:ilvl w:val="0"/>
+          <w:numId w:val="1"/>
+        </w:numPr>
+      </w:pPr>
+      <w:r>
+        <w:t>Finalize and update all documentation.</w:t>
+      </w:r>
+    </w:p>
+    <w:p>
+      <w:pPr>
+        <w:pStyle w:val="Lijstalinea"/>
+        <w:numPr>
+          <w:ilvl w:val="0"/>
+          <w:numId w:val="1"/>
+        </w:numPr>
+      </w:pPr>
+      <w:r>
+        <w:t>Make the product series-ready (production-ready).</w:t>
+      </w:r>
+    </w:p>
+    <w:p>
+      <w:pPr>
+        <w:pStyle w:val="Lijstalinea"/>
+        <w:numPr>
+          <w:ilvl w:val="0"/>
+          <w:numId w:val="1"/>
+        </w:numPr>
+      </w:pPr>
+      <w:r>
+        <w:t>Transfer the product to the sales matrix / into production.</w:t>
+      </w:r>
+    </w:p>
+    <w:p>
+      <w:pPr>
+        <w:pStyle w:val="Lijstalinea"/>
+        <w:numPr>
+          <w:ilvl w:val="0"/>
+          <w:numId w:val="1"/>
+        </w:numPr>
+      </w:pPr>
+      <w:r>
+        <w:t>Ongoing monitoring and maintenance.</w:t>
+      </w:r>
+    </w:p>
+    <w:p>
+      <w:pPr>
+        <w:pStyle w:val="Lijstalinea"/>
+        <w:numPr>
+          <w:ilvl w:val="0"/>
+          <w:numId w:val="1"/>
+        </w:numPr>
+      </w:pPr>
+      <w:r>
+        <w:t>Runs in live operation / series production — the real product, in real use, at production quality.</w:t>
+      </w:r>
+    </w:p>
+    <w:p>
+      <w:pPr>
+        <w:pStyle w:val="Kop2"/>
+      </w:pPr>
+      <w:r>
+        <w:t>Typical output / evidence</w:t>
+      </w:r>
+    </w:p>
+    <w:p>
+      <w:pPr/>
+      <w:r>
+        <w:t xml:space="preserve">A released, series-ready product; final documentation; the product in the sales catalogue; and field reliability data. Ends with a final acceptance </w:t>
+      </w:r>
+      <w:r>
+        <w:rPr>
+          <w:b/>
+        </w:rPr>
+        <w:t>tollgate review</w:t>
+      </w:r>
+      <w:r>
+        <w:t>. Common pitfalls to avoid: declaring TRL 9 from a single successful install rather than proven routine operation, letting documentation drift out of date once the product ships, and having no feedback loop from field data into maintenance.</w:t>
+      </w:r>
+    </w:p>
+    <w:p>
+      <w:pPr/>
+    </w:p>
+    <w:p>
+      <w:pPr/>
+      <w:r>
+        <w:t>Note: In this repo, TRL 9 is the "finalize product and transfer to sales matrix" task. For the 400 A charger and the e-PU Cabinet V2 BESS it means the production-ready unit, complete documentation, and the product in VDL Energy Systems' sales matrix, with field uptime (&gt; 98 %) monitored in service.</w:t>
       </w:r>
     </w:p>
     <w:p>

</xml_diff>